<commit_message>
feat(certificates): add support for letters of recommendation, enhance internship certificate generation with role and duration details
</commit_message>
<xml_diff>
--- a/frontend/public/course-certificates/Airkrit Certificates/Airkrit India Training Certificate - AI-01171 - Template.docx
+++ b/frontend/public/course-certificates/Airkrit Certificates/Airkrit India Training Certificate - AI-01171 - Template.docx
@@ -56,11 +56,9 @@
           </wp:anchor>
         </w:drawing>
       </w:r>
-      <w:proofErr w:type="spellStart"/>
       <w:r>
         <w:t>Airkrit</w:t>
       </w:r>
-      <w:proofErr w:type="spellEnd"/>
       <w:r>
         <w:rPr>
           <w:spacing w:val="-5"/>
@@ -325,7 +323,7 @@
           </mc:Choice>
           <mc:Fallback>
             <w:pict>
-              <v:shape w14:anchorId="7B9DE4CE" id="Graphic 2" o:spid="_x0000_s1026" style="position:absolute;margin-left:70.55pt;margin-top:-11.6pt;width:469.45pt;height:1.45pt;z-index:15729152;visibility:visible;mso-wrap-style:square;mso-wrap-distance-left:0;mso-wrap-distance-top:0;mso-wrap-distance-right:0;mso-wrap-distance-bottom:0;mso-position-horizontal:absolute;mso-position-horizontal-relative:page;mso-position-vertical:absolute;mso-position-vertical-relative:text;v-text-anchor:top" coordsize="5962015,18415" o:gfxdata="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" path="m5961888,l,,,18288r5961888,l5961888,xe" fillcolor="black" stroked="f">
+              <v:shape w14:anchorId="75D42500" id="Graphic 2" o:spid="_x0000_s1026" style="position:absolute;margin-left:70.55pt;margin-top:-11.6pt;width:469.45pt;height:1.45pt;z-index:15729152;visibility:visible;mso-wrap-style:square;mso-wrap-distance-left:0;mso-wrap-distance-top:0;mso-wrap-distance-right:0;mso-wrap-distance-bottom:0;mso-position-horizontal:absolute;mso-position-horizontal-relative:page;mso-position-vertical:absolute;mso-position-vertical-relative:text;v-text-anchor:top" coordsize="5962015,18415" o:gfxdata="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" path="m5961888,l,,,18288r5961888,l5961888,xe" fillcolor="black" stroked="f">
                 <v:path arrowok="t"/>
                 <w10:wrap anchorx="page"/>
               </v:shape>
@@ -499,7 +497,7 @@
           </mc:Choice>
           <mc:Fallback>
             <w:pict>
-              <v:group w14:anchorId="040AC7A4" id="Group 3" o:spid="_x0000_s1026" style="position:absolute;margin-left:72.25pt;margin-top:6.65pt;width:455.9pt;height:377.45pt;z-index:-15767040;mso-wrap-distance-left:0;mso-wrap-distance-right:0;mso-position-horizontal-relative:page;mso-height-relative:margin" coordsize="57899,47936" o:gfxdata="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">
+              <v:group w14:anchorId="49C4FF62" id="Group 3" o:spid="_x0000_s1026" style="position:absolute;margin-left:72.25pt;margin-top:6.65pt;width:455.9pt;height:377.45pt;z-index:-15767040;mso-wrap-distance-left:0;mso-wrap-distance-right:0;mso-position-horizontal-relative:page;mso-height-relative:margin" coordsize="57899,47936" o:gfxdata="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">
                 <v:shapetype id="_x0000_t75" coordsize="21600,21600" o:spt="75" o:preferrelative="t" path="m@4@5l@4@11@9@11@9@5xe" filled="f" stroked="f">
                   <v:stroke joinstyle="miter"/>
                   <v:formulas>
@@ -857,19 +855,11 @@
       <w:r>
         <w:t xml:space="preserve">offered by </w:t>
       </w:r>
-      <w:proofErr w:type="spellStart"/>
-      <w:r>
-        <w:rPr>
-          <w:b/>
-        </w:rPr>
-        <w:t>Airkrit</w:t>
-      </w:r>
-      <w:proofErr w:type="spellEnd"/>
-      <w:r>
-        <w:rPr>
-          <w:b/>
-        </w:rPr>
-        <w:t xml:space="preserve"> India</w:t>
+      <w:r>
+        <w:rPr>
+          <w:b/>
+        </w:rPr>
+        <w:t>Airkrit India</w:t>
       </w:r>
       <w:r>
         <w:t>. Through this program, [he/she] have acquired essential skills in [</w:t>
@@ -914,7 +904,10 @@
         <w:t xml:space="preserve"> </w:t>
       </w:r>
       <w:r>
-        <w:t>course,</w:t>
+        <w:t>training</w:t>
+      </w:r>
+      <w:r>
+        <w:t>,</w:t>
       </w:r>
       <w:r>
         <w:rPr>
@@ -1339,25 +1332,7 @@
           <w:bCs/>
           <w:lang w:val="en-IN"/>
         </w:rPr>
-        <w:t>[%</w:t>
-      </w:r>
-      <w:proofErr w:type="spellStart"/>
-      <w:r>
-        <w:rPr>
-          <w:b/>
-          <w:bCs/>
-          <w:lang w:val="en-IN"/>
-        </w:rPr>
-        <w:t>qrImage</w:t>
-      </w:r>
-      <w:proofErr w:type="spellEnd"/>
-      <w:r>
-        <w:rPr>
-          <w:b/>
-          <w:bCs/>
-          <w:lang w:val="en-IN"/>
-        </w:rPr>
-        <w:t>]</w:t>
+        <w:t>[%qrImage]</w:t>
       </w:r>
     </w:p>
     <w:p>
@@ -1477,14 +1452,12 @@
           <w:b/>
         </w:rPr>
       </w:pPr>
-      <w:proofErr w:type="spellStart"/>
       <w:r>
         <w:rPr>
           <w:b/>
         </w:rPr>
         <w:t>Airkrit</w:t>
       </w:r>
-      <w:proofErr w:type="spellEnd"/>
       <w:r>
         <w:rPr>
           <w:b/>
@@ -2109,6 +2082,7 @@
   <w:style w:type="character" w:default="1" w:styleId="DefaultParagraphFont">
     <w:name w:val="Default Paragraph Font"/>
     <w:uiPriority w:val="1"/>
+    <w:semiHidden/>
     <w:unhideWhenUsed/>
   </w:style>
   <w:style w:type="table" w:default="1" w:styleId="TableNormal">

</xml_diff>